<commit_message>
minor update to custody instructions
</commit_message>
<xml_diff>
--- a/docassemble/MLHDivorceAndCustody/data/templates/instructions_custody_complaint.docx
+++ b/docassemble/MLHDivorceAndCustody/data/templates/instructions_custody_complaint.docx
@@ -549,7 +549,6 @@
         <w:t xml:space="preserve">Custody cases are now e-filed in Oakland County. Please note that completing the documents on Michigan Legal Help or Law Help Interactive does not file anything with the court. You will need to upload your documents in </w:t>
       </w:r>
       <w:hyperlink r:id="rId7">
-        <w:proofErr w:type="spellStart"/>
         <w:r>
           <w:rPr>
             <w:b/>
@@ -559,7 +558,6 @@
           </w:rPr>
           <w:t>MiFILE</w:t>
         </w:r>
-        <w:proofErr w:type="spellEnd"/>
       </w:hyperlink>
       <w:r>
         <w:rPr>
@@ -628,16 +626,8 @@
         <w:rPr>
           <w:color w:val="222222"/>
         </w:rPr>
-        <w:t xml:space="preserve">E-filing using </w:t>
-      </w:r>
-      <w:proofErr w:type="spellStart"/>
-      <w:r>
-        <w:rPr>
-          <w:color w:val="222222"/>
-        </w:rPr>
-        <w:t>MiFILE</w:t>
-      </w:r>
-      <w:proofErr w:type="spellEnd"/>
+        <w:t>E-filing using MiFILE</w:t>
+      </w:r>
     </w:p>
     <w:p>
       <w:pPr>
@@ -677,7 +667,6 @@
     </w:p>
     <w:p>
       <w:hyperlink r:id="rId9">
-        <w:proofErr w:type="spellStart"/>
         <w:r>
           <w:rPr>
             <w:color w:val="1155CC"/>
@@ -685,40 +674,35 @@
           </w:rPr>
           <w:t>MiFILE</w:t>
         </w:r>
-        <w:proofErr w:type="spellEnd"/>
       </w:hyperlink>
       <w:r>
-        <w:t xml:space="preserve"> is only available for some courts. Even in courts where it is available, you can only use it for some case types. The State Court Administrative Office keeps a </w:t>
-      </w:r>
-      <w:hyperlink r:id="rId10">
+        <w:t xml:space="preserve"> is only available for some courts. Even in courts where it is available, you can only use it for some case types. </w:t>
+      </w:r>
+      <w:r>
+        <w:t xml:space="preserve">Click this link to </w:t>
+      </w:r>
+      <w:hyperlink r:id="rId10" w:history="1">
         <w:r>
           <w:rPr>
             <w:color w:val="1155CC"/>
             <w:u w:val="single"/>
           </w:rPr>
-          <w:t>chart of courts that use e-filing</w:t>
+          <w:t>check if you can e-file</w:t>
         </w:r>
       </w:hyperlink>
       <w:r>
-        <w:t xml:space="preserve">. To learn more, read </w:t>
-      </w:r>
-      <w:hyperlink r:id="rId11">
-        <w:r>
-          <w:rPr>
-            <w:color w:val="1155CC"/>
-            <w:u w:val="single"/>
-          </w:rPr>
-          <w:t>What Is E-Filing?</w:t>
-        </w:r>
-      </w:hyperlink>
-      <w:r>
         <w:t>.</w:t>
       </w:r>
     </w:p>
     <w:p>
       <w:r>
-        <w:t>{%p endif %}</w:t>
-      </w:r>
+        <w:t xml:space="preserve">{%p </w:t>
+      </w:r>
+      <w:proofErr w:type="gramStart"/>
+      <w:r>
+        <w:t>endif %}</w:t>
+      </w:r>
+      <w:proofErr w:type="gramEnd"/>
     </w:p>
     <w:p>
       <w:pPr>
@@ -847,7 +831,7 @@
         </w:rPr>
         <w:t xml:space="preserve">If you receive public assistance based on having low income, you will get a completed Fee Waiver Request with your other documents from the </w:t>
       </w:r>
-      <w:hyperlink r:id="rId12">
+      <w:hyperlink r:id="rId11">
         <w:r>
           <w:rPr>
             <w:color w:val="1155CC"/>
@@ -862,7 +846,7 @@
         </w:rPr>
         <w:t xml:space="preserve"> tool. Otherwise, you can use the </w:t>
       </w:r>
-      <w:hyperlink r:id="rId13">
+      <w:hyperlink r:id="rId12">
         <w:r>
           <w:rPr>
             <w:color w:val="1155CC"/>
@@ -891,7 +875,7 @@
         </w:rPr>
         <w:t xml:space="preserve">To learn more, read </w:t>
       </w:r>
-      <w:hyperlink r:id="rId14">
+      <w:hyperlink r:id="rId13">
         <w:r>
           <w:rPr>
             <w:color w:val="1155CC"/>
@@ -1008,7 +992,6 @@
         <w:rPr>
           <w:color w:val="222222"/>
         </w:rPr>
-        <w:lastRenderedPageBreak/>
         <w:t xml:space="preserve">Fee Waiver Request (if needed) – </w:t>
       </w:r>
       <w:r>
@@ -1035,6 +1018,7 @@
         <w:rPr>
           <w:color w:val="222222"/>
         </w:rPr>
+        <w:lastRenderedPageBreak/>
         <w:t xml:space="preserve">Summons and Complaint – </w:t>
       </w:r>
       <w:r>
@@ -1244,7 +1228,7 @@
         </w:rPr>
         <w:t>(Keep the second page to use as a</w:t>
       </w:r>
-      <w:hyperlink r:id="rId15">
+      <w:hyperlink r:id="rId14">
         <w:r>
           <w:rPr>
             <w:color w:val="222222"/>
@@ -1645,183 +1629,164 @@
           <w:bCs/>
           <w:color w:val="222222"/>
         </w:rPr>
-        <w:t xml:space="preserve">If you are filing either by </w:t>
+        <w:t xml:space="preserve">If you are filing either by MiFILE or email, </w:t>
+      </w:r>
+      <w:r>
+        <w:rPr>
+          <w:color w:val="222222"/>
+        </w:rPr>
+        <w:t>you will not need copies for the Friend of the Court. You will only need to make copies for yourself and the other party.</w:t>
+      </w:r>
+    </w:p>
+    <w:p>
+      <w:r>
+        <w:t xml:space="preserve">{%p </w:t>
+      </w:r>
+      <w:proofErr w:type="gramStart"/>
+      <w:r>
+        <w:t>endif %}</w:t>
+      </w:r>
+      <w:proofErr w:type="gramEnd"/>
+    </w:p>
+    <w:p>
+      <w:pPr>
+        <w:pStyle w:val="Heading3"/>
+      </w:pPr>
+      <w:r>
+        <w:lastRenderedPageBreak/>
+        <w:t>Step 5: File your forms with filing fee</w:t>
+      </w:r>
+    </w:p>
+    <w:p>
+      <w:pPr>
+        <w:spacing w:before="180" w:after="180"/>
+        <w:rPr>
+          <w:color w:val="222222"/>
+        </w:rPr>
+      </w:pPr>
+      <w:r>
+        <w:rPr>
+          <w:color w:val="222222"/>
+        </w:rPr>
+        <w:t xml:space="preserve">{%p if </w:t>
       </w:r>
       <w:proofErr w:type="spellStart"/>
+      <w:r>
+        <w:rPr>
+          <w:color w:val="222222"/>
+        </w:rPr>
+        <w:t>county_choice</w:t>
+      </w:r>
+      <w:proofErr w:type="spellEnd"/>
+      <w:r>
+        <w:rPr>
+          <w:color w:val="222222"/>
+        </w:rPr>
+        <w:t xml:space="preserve"> == “Ingham” </w:t>
+      </w:r>
+      <w:r>
+        <w:rPr>
+          <w:color w:val="222222"/>
+        </w:rPr>
+        <w:t>%}</w:t>
+      </w:r>
+    </w:p>
+    <w:p>
+      <w:pPr>
+        <w:spacing w:before="180"/>
+      </w:pPr>
+      <w:r>
+        <w:t>File your forms at the circuit court clerk's office.</w:t>
+      </w:r>
+    </w:p>
+    <w:p>
+      <w:pPr>
+        <w:spacing w:before="180"/>
+        <w:rPr>
+          <w:color w:val="222222"/>
+        </w:rPr>
+      </w:pPr>
+      <w:r>
+        <w:t>It will cost you at least $175 to file a complaint for custody. There is also an $80 judgment fee due at the time of filing. There may be more costs such as charges for having papers served on your child’s other parent, motion filing fees, and costs for alternative dispute resolution services (mediation).</w:t>
+      </w:r>
+    </w:p>
+    <w:p>
+      <w:pPr>
+        <w:rPr>
+          <w:color w:val="222222"/>
+        </w:rPr>
+      </w:pPr>
+      <w:r>
+        <w:rPr>
+          <w:color w:val="222222"/>
+        </w:rPr>
+        <w:t xml:space="preserve">{%p </w:t>
+      </w:r>
+      <w:proofErr w:type="spellStart"/>
+      <w:r>
+        <w:rPr>
+          <w:color w:val="222222"/>
+        </w:rPr>
+        <w:t>el</w:t>
+      </w:r>
+      <w:r>
+        <w:rPr>
+          <w:color w:val="222222"/>
+        </w:rPr>
+        <w:t>if</w:t>
+      </w:r>
+      <w:proofErr w:type="spellEnd"/>
+      <w:r>
+        <w:rPr>
+          <w:color w:val="222222"/>
+        </w:rPr>
+        <w:t xml:space="preserve"> </w:t>
+      </w:r>
+      <w:proofErr w:type="spellStart"/>
+      <w:r>
+        <w:rPr>
+          <w:color w:val="222222"/>
+        </w:rPr>
+        <w:t>county_choice</w:t>
+      </w:r>
+      <w:proofErr w:type="spellEnd"/>
+      <w:r>
+        <w:rPr>
+          <w:color w:val="222222"/>
+        </w:rPr>
+        <w:t xml:space="preserve"> == “Oakland” </w:t>
+      </w:r>
+      <w:r>
+        <w:rPr>
+          <w:color w:val="222222"/>
+        </w:rPr>
+        <w:t>%}</w:t>
+      </w:r>
+    </w:p>
+    <w:p>
+      <w:pPr>
+        <w:spacing w:before="180" w:after="180"/>
+      </w:pPr>
       <w:r>
         <w:rPr>
           <w:b/>
           <w:bCs/>
-          <w:color w:val="222222"/>
-        </w:rPr>
-        <w:t>MiFILE</w:t>
-      </w:r>
-      <w:proofErr w:type="spellEnd"/>
+        </w:rPr>
+        <w:t>Oakland County requires this type of case to be e-filed. Please note that completing the documents on Michigan Legal Help or Law Help Interactive does not file anything with the court.</w:t>
+      </w:r>
+    </w:p>
+    <w:p>
+      <w:pPr>
+        <w:spacing w:before="180" w:after="180"/>
+      </w:pPr>
       <w:r>
         <w:rPr>
           <w:b/>
           <w:bCs/>
-          <w:color w:val="222222"/>
-        </w:rPr>
-        <w:t xml:space="preserve"> or email, </w:t>
-      </w:r>
-      <w:r>
-        <w:rPr>
-          <w:color w:val="222222"/>
-        </w:rPr>
-        <w:t>you will not need copies for the Friend of the Court. You will only need to make copies for yourself and the other party.</w:t>
-      </w:r>
-    </w:p>
-    <w:p>
-      <w:r>
-        <w:t xml:space="preserve">{%p </w:t>
-      </w:r>
-      <w:proofErr w:type="gramStart"/>
-      <w:r>
-        <w:t>endif %}</w:t>
-      </w:r>
-      <w:proofErr w:type="gramEnd"/>
-    </w:p>
-    <w:p>
-      <w:pPr>
-        <w:pStyle w:val="Heading3"/>
-      </w:pPr>
-      <w:r>
-        <w:lastRenderedPageBreak/>
-        <w:t>Step 5: File your forms with filing fee</w:t>
-      </w:r>
-    </w:p>
-    <w:p>
-      <w:pPr>
-        <w:spacing w:before="180" w:after="180"/>
-        <w:rPr>
-          <w:color w:val="222222"/>
-        </w:rPr>
-      </w:pPr>
-      <w:r>
-        <w:rPr>
-          <w:color w:val="222222"/>
-        </w:rPr>
-        <w:t xml:space="preserve">{%p if </w:t>
-      </w:r>
-      <w:proofErr w:type="spellStart"/>
-      <w:r>
-        <w:rPr>
-          <w:color w:val="222222"/>
-        </w:rPr>
-        <w:t>county_choice</w:t>
-      </w:r>
-      <w:proofErr w:type="spellEnd"/>
-      <w:r>
-        <w:rPr>
-          <w:color w:val="222222"/>
-        </w:rPr>
-        <w:t xml:space="preserve"> == “Ingham” </w:t>
-      </w:r>
-      <w:r>
-        <w:rPr>
-          <w:color w:val="222222"/>
-        </w:rPr>
-        <w:t>%}</w:t>
-      </w:r>
-    </w:p>
-    <w:p>
-      <w:pPr>
-        <w:spacing w:before="180"/>
-      </w:pPr>
-      <w:r>
-        <w:t>File your forms at the circuit court clerk's office.</w:t>
-      </w:r>
-    </w:p>
-    <w:p>
-      <w:pPr>
-        <w:spacing w:before="180"/>
-        <w:rPr>
-          <w:color w:val="222222"/>
-        </w:rPr>
-      </w:pPr>
-      <w:r>
-        <w:t>It will cost you at least $175 to file a complaint for custody. There is also an $80 judgment fee due at the time of filing. There may be more costs such as charges for having papers served on your child’s other parent, motion filing fees, and costs for alternative dispute resolution services (mediation).</w:t>
-      </w:r>
-    </w:p>
-    <w:p>
-      <w:pPr>
-        <w:rPr>
-          <w:color w:val="222222"/>
-        </w:rPr>
-      </w:pPr>
-      <w:r>
-        <w:rPr>
-          <w:color w:val="222222"/>
-        </w:rPr>
-        <w:t xml:space="preserve">{%p </w:t>
-      </w:r>
-      <w:proofErr w:type="spellStart"/>
-      <w:r>
-        <w:rPr>
-          <w:color w:val="222222"/>
-        </w:rPr>
-        <w:t>el</w:t>
-      </w:r>
-      <w:r>
-        <w:rPr>
-          <w:color w:val="222222"/>
-        </w:rPr>
-        <w:t>if</w:t>
-      </w:r>
-      <w:proofErr w:type="spellEnd"/>
-      <w:r>
-        <w:rPr>
-          <w:color w:val="222222"/>
-        </w:rPr>
-        <w:t xml:space="preserve"> </w:t>
-      </w:r>
-      <w:proofErr w:type="spellStart"/>
-      <w:r>
-        <w:rPr>
-          <w:color w:val="222222"/>
-        </w:rPr>
-        <w:t>county_choice</w:t>
-      </w:r>
-      <w:proofErr w:type="spellEnd"/>
-      <w:r>
-        <w:rPr>
-          <w:color w:val="222222"/>
-        </w:rPr>
-        <w:t xml:space="preserve"> == “Oakland” </w:t>
-      </w:r>
-      <w:r>
-        <w:rPr>
-          <w:color w:val="222222"/>
-        </w:rPr>
-        <w:t>%}</w:t>
-      </w:r>
-    </w:p>
-    <w:p>
-      <w:pPr>
-        <w:spacing w:before="180" w:after="180"/>
-      </w:pPr>
-      <w:r>
-        <w:rPr>
-          <w:b/>
-          <w:bCs/>
-        </w:rPr>
-        <w:t>Oakland County requires this type of case to be e-filed. Please note that completing the documents on Michigan Legal Help or Law Help Interactive does not file anything with the court.</w:t>
-      </w:r>
-    </w:p>
-    <w:p>
-      <w:pPr>
-        <w:spacing w:before="180" w:after="180"/>
-      </w:pPr>
-      <w:r>
-        <w:rPr>
-          <w:b/>
-          <w:bCs/>
         </w:rPr>
         <w:t xml:space="preserve">Upload your documents in </w:t>
       </w:r>
-      <w:hyperlink r:id="rId16">
-        <w:proofErr w:type="spellStart"/>
+      <w:hyperlink r:id="rId15">
         <w:r>
           <w:rPr>
             <w:b/>
@@ -1831,32 +1796,15 @@
           </w:rPr>
           <w:t>MiFILE</w:t>
         </w:r>
-        <w:proofErr w:type="spellEnd"/>
       </w:hyperlink>
       <w:r>
         <w:rPr>
           <w:b/>
           <w:bCs/>
         </w:rPr>
-        <w:t xml:space="preserve">. Within </w:t>
-      </w:r>
-      <w:proofErr w:type="spellStart"/>
-      <w:r>
-        <w:rPr>
-          <w:b/>
-          <w:bCs/>
-        </w:rPr>
-        <w:t>MiFILE</w:t>
-      </w:r>
-      <w:proofErr w:type="spellEnd"/>
-      <w:r>
-        <w:rPr>
-          <w:b/>
-          <w:bCs/>
-        </w:rPr>
-        <w:t xml:space="preserve">, you will need to choose a drop down label for each individual document you upload. Choose "NEW CASE FILING FEE WITH MINOR - $255.00" for the Complaint, and "MISCELLANEOUS- $0.00" for all other documents. For more information about how to do this, please visit the </w:t>
-      </w:r>
-      <w:hyperlink r:id="rId17">
+        <w:t xml:space="preserve">. Within MiFILE, you will need to choose a drop down label for each individual document you upload. Choose "NEW CASE FILING FEE WITH MINOR - $255.00" for the Complaint, and "MISCELLANEOUS- $0.00" for all other documents. For more information about how to do this, please visit the </w:t>
+      </w:r>
+      <w:hyperlink r:id="rId16">
         <w:r>
           <w:rPr>
             <w:b/>
@@ -1925,21 +1873,7 @@
         <w:rPr>
           <w:color w:val="222222"/>
         </w:rPr>
-        <w:t xml:space="preserve">Contact your court to find out which filing methods are available. Depending on your court, you may be able to file electronically. To learn more about filing methods that may be available, read Step 1. If you are e-filing using </w:t>
-      </w:r>
-      <w:proofErr w:type="spellStart"/>
-      <w:r>
-        <w:rPr>
-          <w:color w:val="222222"/>
-        </w:rPr>
-        <w:t>MiFILE</w:t>
-      </w:r>
-      <w:proofErr w:type="spellEnd"/>
-      <w:r>
-        <w:rPr>
-          <w:color w:val="222222"/>
-        </w:rPr>
-        <w:t>, you will need to know the case-type code. The case type code for a custody case is DC.</w:t>
+        <w:t>Contact your court to find out which filing methods are available. Depending on your court, you may be able to file electronically. To learn more about filing methods that may be available, read Step 1. If you are e-filing using MiFILE, you will need to know the case-type code. The case type code for a custody case is DC.</w:t>
       </w:r>
     </w:p>
     <w:p>
@@ -1949,8 +1883,7 @@
           <w:color w:val="222222"/>
         </w:rPr>
       </w:pPr>
-      <w:hyperlink r:id="rId18">
-        <w:proofErr w:type="spellStart"/>
+      <w:hyperlink r:id="rId17">
         <w:r>
           <w:rPr>
             <w:color w:val="1155CC"/>
@@ -1958,7 +1891,6 @@
           </w:rPr>
           <w:t>MiFILE</w:t>
         </w:r>
-        <w:proofErr w:type="spellEnd"/>
       </w:hyperlink>
       <w:r>
         <w:rPr>
@@ -1966,7 +1898,7 @@
         </w:rPr>
         <w:t xml:space="preserve"> is only available for some courts. Even in courts where it is available, you can only use it for some case types. Click this link to </w:t>
       </w:r>
-      <w:hyperlink r:id="rId19">
+      <w:hyperlink r:id="rId18">
         <w:r>
           <w:rPr>
             <w:color w:val="1155CC"/>
@@ -1986,7 +1918,7 @@
       <w:r>
         <w:t xml:space="preserve">If you are filing in person or need contact information for the court, click on </w:t>
       </w:r>
-      <w:hyperlink r:id="rId20">
+      <w:hyperlink r:id="rId19">
         <w:r>
           <w:rPr>
             <w:color w:val="1155CC"/>
@@ -2342,7 +2274,7 @@
         </w:rPr>
         <w:t xml:space="preserve"> </w:t>
       </w:r>
-      <w:hyperlink r:id="rId21">
+      <w:hyperlink r:id="rId20">
         <w:r>
           <w:rPr>
             <w:bCs/>
@@ -4042,6 +3974,18 @@
       <w:lang w:val="en-US"/>
     </w:rPr>
   </w:style>
+  <w:style w:type="character" w:styleId="UnresolvedMention">
+    <w:name w:val="Unresolved Mention"/>
+    <w:basedOn w:val="DefaultParagraphFont"/>
+    <w:uiPriority w:val="99"/>
+    <w:semiHidden/>
+    <w:unhideWhenUsed/>
+    <w:rsid w:val="00753771"/>
+    <w:rPr>
+      <w:color w:val="605E5C"/>
+      <w:shd w:val="clear" w:color="auto" w:fill="E1DFDD"/>
+    </w:rPr>
+  </w:style>
 </w:styles>
 </file>
 

</xml_diff>